<commit_message>
Add return/refund edge-case E2E coverage (TC-13..16)
Deepen the refund path with four edge cases in return.spec.js:
- TC-13 settlement moves money via cash refund or due reduction (PASS)
- TC-14 Total Refunded KPI reconciliation — KPI reads 0 vs ~21,950 settled (FAIL/defect)
- TC-15 no double-settle: settled return exposes no Settle action (PASS)
- TC-16 refund method hardcoded as cash across all settled returns (FAIL/defect)

ReturnActions: add collectSettledFacts/hasSettleAction; fix getDetailFacts
refund parsing (Taka-sign regex bug) and capture dueReduced/cashOut.
Update ticket matrix and regenerate curated docs/Test-Report.

Co-Authored-By: Claude Opus 4.8 <noreply@anthropic.com>
</commit_message>
<xml_diff>
--- a/docs/Test-Report.docx
+++ b/docs/Test-Report.docx
@@ -43,7 +43,7 @@
         <w:t xml:space="preserve">Date: </w:t>
       </w:r>
       <w:r>
-        <w:t xml:space="preserve">2026-06-22</w:t>
+        <w:t xml:space="preserve">2026-06-23</w:t>
       </w:r>
     </w:p>
     <w:p>
@@ -156,35 +156,35 @@
                 <w:b w:val="false"/>
                 <w:bCs w:val="false"/>
               </w:rPr>
-              <w:t xml:space="preserve">13</w:t>
-            </w:r>
-          </w:p>
-        </w:tc>
-        <w:tc>
-          <w:tcPr>
-            <w:tcW w:type="pct" w:w="16%"/>
-          </w:tcPr>
-          <w:p>
-            <w:r>
-              <w:rPr>
-                <w:b w:val="false"/>
-                <w:bCs w:val="false"/>
-              </w:rPr>
-              <w:t xml:space="preserve">9</w:t>
-            </w:r>
-          </w:p>
-        </w:tc>
-        <w:tc>
-          <w:tcPr>
-            <w:tcW w:type="pct" w:w="16%"/>
-          </w:tcPr>
-          <w:p>
-            <w:r>
-              <w:rPr>
-                <w:b w:val="false"/>
-                <w:bCs w:val="false"/>
-              </w:rPr>
-              <w:t xml:space="preserve">3</w:t>
+              <w:t xml:space="preserve">17</w:t>
+            </w:r>
+          </w:p>
+        </w:tc>
+        <w:tc>
+          <w:tcPr>
+            <w:tcW w:type="pct" w:w="16%"/>
+          </w:tcPr>
+          <w:p>
+            <w:r>
+              <w:rPr>
+                <w:b w:val="false"/>
+                <w:bCs w:val="false"/>
+              </w:rPr>
+              <w:t xml:space="preserve">11</w:t>
+            </w:r>
+          </w:p>
+        </w:tc>
+        <w:tc>
+          <w:tcPr>
+            <w:tcW w:type="pct" w:w="16%"/>
+          </w:tcPr>
+          <w:p>
+            <w:r>
+              <w:rPr>
+                <w:b w:val="false"/>
+                <w:bCs w:val="false"/>
+              </w:rPr>
+              <w:t xml:space="preserve">5</w:t>
             </w:r>
           </w:p>
         </w:tc>
@@ -449,6 +449,350 @@
                 <w:bCs w:val="false"/>
               </w:rPr>
               <w:t xml:space="preserve">bKash / digital refund is recorded as a Cash refund</w:t>
+            </w:r>
+          </w:p>
+        </w:tc>
+        <w:tc>
+          <w:tcPr>
+            <w:tcW w:type="pct" w:w="16%"/>
+          </w:tcPr>
+          <w:p>
+            <w:r>
+              <w:rPr>
+                <w:b w:val="false"/>
+                <w:bCs w:val="false"/>
+              </w:rPr>
+              <w:t xml:space="preserve">Refund</w:t>
+            </w:r>
+          </w:p>
+        </w:tc>
+        <w:tc>
+          <w:tcPr>
+            <w:tcW w:type="pct" w:w="16%"/>
+          </w:tcPr>
+          <w:p>
+            <w:r>
+              <w:rPr>
+                <w:b w:val="false"/>
+                <w:bCs w:val="false"/>
+              </w:rPr>
+              <w:t xml:space="preserve">FAIL</w:t>
+            </w:r>
+          </w:p>
+        </w:tc>
+        <w:tc>
+          <w:tcPr>
+            <w:tcW w:type="pct" w:w="16%"/>
+          </w:tcPr>
+          <w:p>
+            <w:r>
+              <w:rPr>
+                <w:b w:val="false"/>
+                <w:bCs w:val="false"/>
+              </w:rPr>
+              <w:t xml:space="preserve">High</w:t>
+            </w:r>
+          </w:p>
+        </w:tc>
+        <w:tc>
+          <w:tcPr>
+            <w:tcW w:type="pct" w:w="16%"/>
+          </w:tcPr>
+          <w:p>
+            <w:r>
+              <w:rPr>
+                <w:b w:val="false"/>
+                <w:bCs w:val="false"/>
+              </w:rPr>
+              <w:t xml:space="preserve">Medium</w:t>
+            </w:r>
+          </w:p>
+        </w:tc>
+      </w:tr>
+      <w:tr>
+        <w:tc>
+          <w:tcPr>
+            <w:tcW w:type="pct" w:w="16%"/>
+          </w:tcPr>
+          <w:p>
+            <w:r>
+              <w:rPr>
+                <w:b w:val="false"/>
+                <w:bCs w:val="false"/>
+              </w:rPr>
+              <w:t xml:space="preserve">TC-13</w:t>
+            </w:r>
+          </w:p>
+        </w:tc>
+        <w:tc>
+          <w:tcPr>
+            <w:tcW w:type="pct" w:w="16%"/>
+          </w:tcPr>
+          <w:p>
+            <w:r>
+              <w:rPr>
+                <w:b w:val="false"/>
+                <w:bCs w:val="false"/>
+              </w:rPr>
+              <w:t xml:space="preserve">Settled return moves money via cash refund or due reduction</w:t>
+            </w:r>
+          </w:p>
+        </w:tc>
+        <w:tc>
+          <w:tcPr>
+            <w:tcW w:type="pct" w:w="16%"/>
+          </w:tcPr>
+          <w:p>
+            <w:r>
+              <w:rPr>
+                <w:b w:val="false"/>
+                <w:bCs w:val="false"/>
+              </w:rPr>
+              <w:t xml:space="preserve">Refund</w:t>
+            </w:r>
+          </w:p>
+        </w:tc>
+        <w:tc>
+          <w:tcPr>
+            <w:tcW w:type="pct" w:w="16%"/>
+          </w:tcPr>
+          <w:p>
+            <w:r>
+              <w:rPr>
+                <w:b w:val="false"/>
+                <w:bCs w:val="false"/>
+              </w:rPr>
+              <w:t xml:space="preserve">PASS</w:t>
+            </w:r>
+          </w:p>
+        </w:tc>
+        <w:tc>
+          <w:tcPr>
+            <w:tcW w:type="pct" w:w="16%"/>
+          </w:tcPr>
+          <w:p>
+            <w:r>
+              <w:rPr>
+                <w:b w:val="false"/>
+                <w:bCs w:val="false"/>
+              </w:rPr>
+              <w:t xml:space="preserve">High</w:t>
+            </w:r>
+          </w:p>
+        </w:tc>
+        <w:tc>
+          <w:tcPr>
+            <w:tcW w:type="pct" w:w="16%"/>
+          </w:tcPr>
+          <w:p>
+            <w:r>
+              <w:rPr>
+                <w:b w:val="false"/>
+                <w:bCs w:val="false"/>
+              </w:rPr>
+              <w:t xml:space="preserve">High</w:t>
+            </w:r>
+          </w:p>
+        </w:tc>
+      </w:tr>
+      <w:tr>
+        <w:tc>
+          <w:tcPr>
+            <w:tcW w:type="pct" w:w="16%"/>
+          </w:tcPr>
+          <w:p>
+            <w:r>
+              <w:rPr>
+                <w:b w:val="false"/>
+                <w:bCs w:val="false"/>
+              </w:rPr>
+              <w:t xml:space="preserve">TC-14</w:t>
+            </w:r>
+          </w:p>
+        </w:tc>
+        <w:tc>
+          <w:tcPr>
+            <w:tcW w:type="pct" w:w="16%"/>
+          </w:tcPr>
+          <w:p>
+            <w:r>
+              <w:rPr>
+                <w:b w:val="false"/>
+                <w:bCs w:val="false"/>
+              </w:rPr>
+              <w:t xml:space="preserve">Total Refunded KPI does not reconcile with settled-return refunds</w:t>
+            </w:r>
+          </w:p>
+        </w:tc>
+        <w:tc>
+          <w:tcPr>
+            <w:tcW w:type="pct" w:w="16%"/>
+          </w:tcPr>
+          <w:p>
+            <w:r>
+              <w:rPr>
+                <w:b w:val="false"/>
+                <w:bCs w:val="false"/>
+              </w:rPr>
+              <w:t xml:space="preserve">Refund</w:t>
+            </w:r>
+          </w:p>
+        </w:tc>
+        <w:tc>
+          <w:tcPr>
+            <w:tcW w:type="pct" w:w="16%"/>
+          </w:tcPr>
+          <w:p>
+            <w:r>
+              <w:rPr>
+                <w:b w:val="false"/>
+                <w:bCs w:val="false"/>
+              </w:rPr>
+              <w:t xml:space="preserve">FAIL</w:t>
+            </w:r>
+          </w:p>
+        </w:tc>
+        <w:tc>
+          <w:tcPr>
+            <w:tcW w:type="pct" w:w="16%"/>
+          </w:tcPr>
+          <w:p>
+            <w:r>
+              <w:rPr>
+                <w:b w:val="false"/>
+                <w:bCs w:val="false"/>
+              </w:rPr>
+              <w:t xml:space="preserve">High</w:t>
+            </w:r>
+          </w:p>
+        </w:tc>
+        <w:tc>
+          <w:tcPr>
+            <w:tcW w:type="pct" w:w="16%"/>
+          </w:tcPr>
+          <w:p>
+            <w:r>
+              <w:rPr>
+                <w:b w:val="false"/>
+                <w:bCs w:val="false"/>
+              </w:rPr>
+              <w:t xml:space="preserve">High</w:t>
+            </w:r>
+          </w:p>
+        </w:tc>
+      </w:tr>
+      <w:tr>
+        <w:tc>
+          <w:tcPr>
+            <w:tcW w:type="pct" w:w="16%"/>
+          </w:tcPr>
+          <w:p>
+            <w:r>
+              <w:rPr>
+                <w:b w:val="false"/>
+                <w:bCs w:val="false"/>
+              </w:rPr>
+              <w:t xml:space="preserve">TC-15</w:t>
+            </w:r>
+          </w:p>
+        </w:tc>
+        <w:tc>
+          <w:tcPr>
+            <w:tcW w:type="pct" w:w="16%"/>
+          </w:tcPr>
+          <w:p>
+            <w:r>
+              <w:rPr>
+                <w:b w:val="false"/>
+                <w:bCs w:val="false"/>
+              </w:rPr>
+              <w:t xml:space="preserve">No double-settle — a settled return exposes no Settle action</w:t>
+            </w:r>
+          </w:p>
+        </w:tc>
+        <w:tc>
+          <w:tcPr>
+            <w:tcW w:type="pct" w:w="16%"/>
+          </w:tcPr>
+          <w:p>
+            <w:r>
+              <w:rPr>
+                <w:b w:val="false"/>
+                <w:bCs w:val="false"/>
+              </w:rPr>
+              <w:t xml:space="preserve">Return</w:t>
+            </w:r>
+          </w:p>
+        </w:tc>
+        <w:tc>
+          <w:tcPr>
+            <w:tcW w:type="pct" w:w="16%"/>
+          </w:tcPr>
+          <w:p>
+            <w:r>
+              <w:rPr>
+                <w:b w:val="false"/>
+                <w:bCs w:val="false"/>
+              </w:rPr>
+              <w:t xml:space="preserve">PASS</w:t>
+            </w:r>
+          </w:p>
+        </w:tc>
+        <w:tc>
+          <w:tcPr>
+            <w:tcW w:type="pct" w:w="16%"/>
+          </w:tcPr>
+          <w:p>
+            <w:r>
+              <w:rPr>
+                <w:b w:val="false"/>
+                <w:bCs w:val="false"/>
+              </w:rPr>
+              <w:t xml:space="preserve">High</w:t>
+            </w:r>
+          </w:p>
+        </w:tc>
+        <w:tc>
+          <w:tcPr>
+            <w:tcW w:type="pct" w:w="16%"/>
+          </w:tcPr>
+          <w:p>
+            <w:r>
+              <w:rPr>
+                <w:b w:val="false"/>
+                <w:bCs w:val="false"/>
+              </w:rPr>
+              <w:t xml:space="preserve">Medium</w:t>
+            </w:r>
+          </w:p>
+        </w:tc>
+      </w:tr>
+      <w:tr>
+        <w:tc>
+          <w:tcPr>
+            <w:tcW w:type="pct" w:w="16%"/>
+          </w:tcPr>
+          <w:p>
+            <w:r>
+              <w:rPr>
+                <w:b w:val="false"/>
+                <w:bCs w:val="false"/>
+              </w:rPr>
+              <w:t xml:space="preserve">TC-16</w:t>
+            </w:r>
+          </w:p>
+        </w:tc>
+        <w:tc>
+          <w:tcPr>
+            <w:tcW w:type="pct" w:w="16%"/>
+          </w:tcPr>
+          <w:p>
+            <w:r>
+              <w:rPr>
+                <w:b w:val="false"/>
+                <w:bCs w:val="false"/>
+              </w:rPr>
+              <w:t xml:space="preserve">Every settlement records the refund as Cash regardless of payment / settlement type</w:t>
             </w:r>
           </w:p>
         </w:tc>
@@ -1758,7 +2102,7 @@
         <w:pStyle w:val="Heading2"/>
       </w:pPr>
       <w:r>
-        <w:t xml:space="preserve">TC-8 — Returns dashboard "Total Refunded" KPI and REFUND column show 0 / blank</w:t>
+        <w:t xml:space="preserve">TC-14 — Total Refunded KPI does not reconcile with settled-return refunds</w:t>
       </w:r>
     </w:p>
     <w:p>
@@ -1782,7 +2126,7 @@
         <w:t xml:space="preserve">Severity: </w:t>
       </w:r>
       <w:r>
-        <w:t xml:space="preserve">Medium   </w:t>
+        <w:t xml:space="preserve">High   </w:t>
       </w:r>
       <w:r>
         <w:rPr>
@@ -1792,7 +2136,7 @@
         <w:t xml:space="preserve">Priority: </w:t>
       </w:r>
       <w:r>
-        <w:t xml:space="preserve">Medium   </w:t>
+        <w:t xml:space="preserve">High   </w:t>
       </w:r>
       <w:r>
         <w:rPr>
@@ -1816,17 +2160,17 @@
     </w:p>
     <w:p>
       <w:r>
-        <w:t xml:space="preserve">1. Open Returns &amp; Refunds</w:t>
-      </w:r>
-    </w:p>
-    <w:p>
-      <w:r>
-        <w:t xml:space="preserve">2. Read the "Total Refunded" KPI card</w:t>
-      </w:r>
-    </w:p>
-    <w:p>
-      <w:r>
-        <w:t xml:space="preserve">3. Read the REFUND column for settled rows</w:t>
+        <w:t xml:space="preserve">1. Open each Settled return and sum its refund / due-reduced value</w:t>
+      </w:r>
+    </w:p>
+    <w:p>
+      <w:r>
+        <w:t xml:space="preserve">2. Read the Total Refunded KPI</w:t>
+      </w:r>
+    </w:p>
+    <w:p>
+      <w:r>
+        <w:t xml:space="preserve">3. Compare the two</w:t>
       </w:r>
     </w:p>
     <w:p>
@@ -1838,7 +2182,7 @@
         <w:t xml:space="preserve">Expected: </w:t>
       </w:r>
       <w:r>
-        <w:t xml:space="preserve">The Returns &amp; Refunds "Total Refunded" KPI and the REFUND column reflect the actual settled refund amounts.</w:t>
+        <w:t xml:space="preserve">The dashboard "Total Refunded" KPI is &gt; 0 and equals (±1) the sum of refunds recorded on settled return details.</w:t>
       </w:r>
     </w:p>
     <w:p>
@@ -1850,7 +2194,7 @@
         <w:t xml:space="preserve">Actual: </w:t>
       </w:r>
       <w:r>
-        <w:t xml:space="preserve">With multiple settled returns refunding ৳3900, ৳1200, etc., the dashboard header still reads "Total Refunded: BDT 0" and every row's REFUND column shows "—". Refund reporting is non-functional.</w:t>
+        <w:t xml:space="preserve">Across 6 settled returns the detail pages record ৳21,950 of refunds/due reductions, yet the "Total Refunded" KPI reads BDT 0 (difference ৳21,950). The aggregate refund KPI is broken — finance cannot reconcile refunds from this dashboard.</w:t>
       </w:r>
     </w:p>
     <w:p>
@@ -1900,7 +2244,7 @@
         <w:pStyle w:val="Heading2"/>
       </w:pPr>
       <w:r>
-        <w:t xml:space="preserve">ENV-1 — Provided Admin Portal URL rejects the supplied credentials</w:t>
+        <w:t xml:space="preserve">TC-16 — Every settlement records the refund as Cash regardless of payment / settlement type</w:t>
       </w:r>
     </w:p>
     <w:p>
@@ -1912,7 +2256,7 @@
         <w:t xml:space="preserve">Area: </w:t>
       </w:r>
       <w:r>
-        <w:t xml:space="preserve">Environment</w:t>
+        <w:t xml:space="preserve">Refund</w:t>
       </w:r>
     </w:p>
     <w:p>
@@ -1924,6 +2268,16 @@
         <w:t xml:space="preserve">Severity: </w:t>
       </w:r>
       <w:r>
+        <w:t xml:space="preserve">High   </w:t>
+      </w:r>
+      <w:r>
+        <w:rPr>
+          <w:b/>
+          <w:bCs/>
+        </w:rPr>
+        <w:t xml:space="preserve">Priority: </w:t>
+      </w:r>
+      <w:r>
         <w:t xml:space="preserve">Medium   </w:t>
       </w:r>
       <w:r>
@@ -1931,20 +2285,10 @@
           <w:b/>
           <w:bCs/>
         </w:rPr>
-        <w:t xml:space="preserve">Priority: </w:t>
-      </w:r>
-      <w:r>
-        <w:t xml:space="preserve">High   </w:t>
-      </w:r>
-      <w:r>
-        <w:rPr>
-          <w:b/>
-          <w:bCs/>
-        </w:rPr>
         <w:t xml:space="preserve">Status: </w:t>
       </w:r>
       <w:r>
-        <w:t xml:space="preserve">BLOCKED</w:t>
+        <w:t xml:space="preserve">FAIL</w:t>
       </w:r>
     </w:p>
     <w:p>
@@ -1958,22 +2302,17 @@
     </w:p>
     <w:p>
       <w:r>
-        <w:t xml:space="preserve">1. Open https://platform-admin.myei.app/login</w:t>
-      </w:r>
-    </w:p>
-    <w:p>
-      <w:r>
-        <w:t xml:space="preserve">2. Sign in with the Store Owner credentials</w:t>
-      </w:r>
-    </w:p>
-    <w:p>
-      <w:r>
-        <w:t xml:space="preserve">3. Observe 401 Invalid credentials</w:t>
-      </w:r>
-    </w:p>
-    <w:p>
-      <w:r>
-        <w:t xml:space="preserve">4. Open https://sk-store.myei.app/admin → redirects to admin.myei.app/shop/sk-store → login succeeds</w:t>
+        <w:t xml:space="preserve">1. Open each Settled return</w:t>
+      </w:r>
+    </w:p>
+    <w:p>
+      <w:r>
+        <w:t xml:space="preserve">2. Inspect the Settlement refund-method label</w:t>
+      </w:r>
+    </w:p>
+    <w:p>
+      <w:r>
+        <w:t xml:space="preserve">3. Flag any recorded as cash where no cash was paid / order was digital</w:t>
       </w:r>
     </w:p>
     <w:p>
@@ -1985,7 +2324,7 @@
         <w:t xml:space="preserve">Expected: </w:t>
       </w:r>
       <w:r>
-        <w:t xml:space="preserve">The Store Owner / Admin User credentials authenticate at the documented Admin Portal (platform-admin.myei.app).</w:t>
+        <w:t xml:space="preserve">The settlement should reflect the real refund route; a digitally-paid order or a due-reduction settlement must not be labelled "Cash refund (cash)".</w:t>
       </w:r>
     </w:p>
     <w:p>
@@ -1997,7 +2336,7 @@
         <w:t xml:space="preserve">Actual: </w:t>
       </w:r>
       <w:r>
-        <w:t xml:space="preserve">platform-admin.myei.app/login → POST /api/v1/auth/admin/login returns 401 "Invalid credentials" for BOTH accounts. Order management actually lives in the EcomIntelligence dashboard at admin.myei.app/shop/sk-store (staff login, /api/v1/auth/staff/login), reached via sk-store.myei.app/admin. Ticket documentation points testers to the wrong portal.</w:t>
+        <w:t xml:space="preserve">5 of 6 sampled settled returns are labelled "Cash refund (cash)" — including RTN-008/007/004 where no cash moved at all (value went to due reduction) and RTN-009 which settles a bKash-paid order. The refund-method label is hardcoded to cash, corrupting reconciliation across the whole settlement history.</w:t>
       </w:r>
     </w:p>
     <w:p>
@@ -2021,6 +2360,295 @@
                   </pic:nvPicPr>
                   <pic:blipFill>
                     <a:blip r:embed="rId9" cstate="none"/>
+                    <a:srcRect/>
+                    <a:stretch>
+                      <a:fillRect/>
+                    </a:stretch>
+                  </pic:blipFill>
+                  <pic:spPr bwMode="auto">
+                    <a:xfrm>
+                      <a:off x="0" y="0"/>
+                      <a:ext cx="5334000" cy="3333750"/>
+                    </a:xfrm>
+                    <a:prstGeom prst="rect">
+                      <a:avLst/>
+                    </a:prstGeom>
+                  </pic:spPr>
+                </pic:pic>
+              </a:graphicData>
+            </a:graphic>
+          </wp:inline>
+        </w:drawing>
+      </w:r>
+    </w:p>
+    <w:p>
+      <w:pPr>
+        <w:pStyle w:val="Heading2"/>
+      </w:pPr>
+      <w:r>
+        <w:t xml:space="preserve">TC-8 — Returns dashboard "Total Refunded" KPI and REFUND column show 0 / blank</w:t>
+      </w:r>
+    </w:p>
+    <w:p>
+      <w:r>
+        <w:rPr>
+          <w:b/>
+          <w:bCs/>
+        </w:rPr>
+        <w:t xml:space="preserve">Area: </w:t>
+      </w:r>
+      <w:r>
+        <w:t xml:space="preserve">Refund</w:t>
+      </w:r>
+    </w:p>
+    <w:p>
+      <w:r>
+        <w:rPr>
+          <w:b/>
+          <w:bCs/>
+        </w:rPr>
+        <w:t xml:space="preserve">Severity: </w:t>
+      </w:r>
+      <w:r>
+        <w:t xml:space="preserve">Medium   </w:t>
+      </w:r>
+      <w:r>
+        <w:rPr>
+          <w:b/>
+          <w:bCs/>
+        </w:rPr>
+        <w:t xml:space="preserve">Priority: </w:t>
+      </w:r>
+      <w:r>
+        <w:t xml:space="preserve">Medium   </w:t>
+      </w:r>
+      <w:r>
+        <w:rPr>
+          <w:b/>
+          <w:bCs/>
+        </w:rPr>
+        <w:t xml:space="preserve">Status: </w:t>
+      </w:r>
+      <w:r>
+        <w:t xml:space="preserve">FAIL</w:t>
+      </w:r>
+    </w:p>
+    <w:p>
+      <w:r>
+        <w:rPr>
+          <w:b/>
+          <w:bCs/>
+        </w:rPr>
+        <w:t xml:space="preserve">Steps to reproduce:</w:t>
+      </w:r>
+    </w:p>
+    <w:p>
+      <w:r>
+        <w:t xml:space="preserve">1. Open Returns &amp; Refunds</w:t>
+      </w:r>
+    </w:p>
+    <w:p>
+      <w:r>
+        <w:t xml:space="preserve">2. Read the "Total Refunded" KPI card</w:t>
+      </w:r>
+    </w:p>
+    <w:p>
+      <w:r>
+        <w:t xml:space="preserve">3. Read the REFUND column for settled rows</w:t>
+      </w:r>
+    </w:p>
+    <w:p>
+      <w:r>
+        <w:rPr>
+          <w:b/>
+          <w:bCs/>
+        </w:rPr>
+        <w:t xml:space="preserve">Expected: </w:t>
+      </w:r>
+      <w:r>
+        <w:t xml:space="preserve">The Returns &amp; Refunds "Total Refunded" KPI and the REFUND column reflect the actual settled refund amounts.</w:t>
+      </w:r>
+    </w:p>
+    <w:p>
+      <w:r>
+        <w:rPr>
+          <w:b/>
+          <w:bCs/>
+        </w:rPr>
+        <w:t xml:space="preserve">Actual: </w:t>
+      </w:r>
+      <w:r>
+        <w:t xml:space="preserve">With multiple settled returns refunding ৳3900, ৳1200, etc., the dashboard header still reads "Total Refunded: BDT 0" and every row's REFUND column shows "—". Refund reporting is non-functional.</w:t>
+      </w:r>
+    </w:p>
+    <w:p>
+      <w:r>
+        <w:drawing>
+          <wp:inline distT="0" distB="0" distL="0" distR="0">
+            <wp:extent cx="5334000" cy="3333750"/>
+            <wp:effectExtent t="0" r="0" b="0" l="0"/>
+            <wp:docPr id="1" name="" descr="" title=""/>
+            <wp:cNvGraphicFramePr>
+              <a:graphicFrameLocks xmlns:a="http://schemas.openxmlformats.org/drawingml/2006/main" noChangeAspect="1"/>
+            </wp:cNvGraphicFramePr>
+            <a:graphic xmlns:a="http://schemas.openxmlformats.org/drawingml/2006/main">
+              <a:graphicData uri="http://schemas.openxmlformats.org/drawingml/2006/picture">
+                <pic:pic xmlns:pic="http://schemas.openxmlformats.org/drawingml/2006/picture">
+                  <pic:nvPicPr>
+                    <pic:cNvPr id="0" name="" descr=""/>
+                    <pic:cNvPicPr>
+                      <a:picLocks noChangeAspect="1" noChangeArrowheads="1"/>
+                    </pic:cNvPicPr>
+                  </pic:nvPicPr>
+                  <pic:blipFill>
+                    <a:blip r:embed="rId10" cstate="none"/>
+                    <a:srcRect/>
+                    <a:stretch>
+                      <a:fillRect/>
+                    </a:stretch>
+                  </pic:blipFill>
+                  <pic:spPr bwMode="auto">
+                    <a:xfrm>
+                      <a:off x="0" y="0"/>
+                      <a:ext cx="5334000" cy="3333750"/>
+                    </a:xfrm>
+                    <a:prstGeom prst="rect">
+                      <a:avLst/>
+                    </a:prstGeom>
+                  </pic:spPr>
+                </pic:pic>
+              </a:graphicData>
+            </a:graphic>
+          </wp:inline>
+        </w:drawing>
+      </w:r>
+    </w:p>
+    <w:p>
+      <w:pPr>
+        <w:pStyle w:val="Heading2"/>
+      </w:pPr>
+      <w:r>
+        <w:t xml:space="preserve">ENV-1 — Provided Admin Portal URL rejects the supplied credentials</w:t>
+      </w:r>
+    </w:p>
+    <w:p>
+      <w:r>
+        <w:rPr>
+          <w:b/>
+          <w:bCs/>
+        </w:rPr>
+        <w:t xml:space="preserve">Area: </w:t>
+      </w:r>
+      <w:r>
+        <w:t xml:space="preserve">Environment</w:t>
+      </w:r>
+    </w:p>
+    <w:p>
+      <w:r>
+        <w:rPr>
+          <w:b/>
+          <w:bCs/>
+        </w:rPr>
+        <w:t xml:space="preserve">Severity: </w:t>
+      </w:r>
+      <w:r>
+        <w:t xml:space="preserve">Medium   </w:t>
+      </w:r>
+      <w:r>
+        <w:rPr>
+          <w:b/>
+          <w:bCs/>
+        </w:rPr>
+        <w:t xml:space="preserve">Priority: </w:t>
+      </w:r>
+      <w:r>
+        <w:t xml:space="preserve">High   </w:t>
+      </w:r>
+      <w:r>
+        <w:rPr>
+          <w:b/>
+          <w:bCs/>
+        </w:rPr>
+        <w:t xml:space="preserve">Status: </w:t>
+      </w:r>
+      <w:r>
+        <w:t xml:space="preserve">BLOCKED</w:t>
+      </w:r>
+    </w:p>
+    <w:p>
+      <w:r>
+        <w:rPr>
+          <w:b/>
+          <w:bCs/>
+        </w:rPr>
+        <w:t xml:space="preserve">Steps to reproduce:</w:t>
+      </w:r>
+    </w:p>
+    <w:p>
+      <w:r>
+        <w:t xml:space="preserve">1. Open https://platform-admin.myei.app/login</w:t>
+      </w:r>
+    </w:p>
+    <w:p>
+      <w:r>
+        <w:t xml:space="preserve">2. Sign in with the Store Owner credentials</w:t>
+      </w:r>
+    </w:p>
+    <w:p>
+      <w:r>
+        <w:t xml:space="preserve">3. Observe 401 Invalid credentials</w:t>
+      </w:r>
+    </w:p>
+    <w:p>
+      <w:r>
+        <w:t xml:space="preserve">4. Open https://sk-store.myei.app/admin → redirects to admin.myei.app/shop/sk-store → login succeeds</w:t>
+      </w:r>
+    </w:p>
+    <w:p>
+      <w:r>
+        <w:rPr>
+          <w:b/>
+          <w:bCs/>
+        </w:rPr>
+        <w:t xml:space="preserve">Expected: </w:t>
+      </w:r>
+      <w:r>
+        <w:t xml:space="preserve">The Store Owner / Admin User credentials authenticate at the documented Admin Portal (platform-admin.myei.app).</w:t>
+      </w:r>
+    </w:p>
+    <w:p>
+      <w:r>
+        <w:rPr>
+          <w:b/>
+          <w:bCs/>
+        </w:rPr>
+        <w:t xml:space="preserve">Actual: </w:t>
+      </w:r>
+      <w:r>
+        <w:t xml:space="preserve">platform-admin.myei.app/login → POST /api/v1/auth/admin/login returns 401 "Invalid credentials" for BOTH accounts. Order management actually lives in the EcomIntelligence dashboard at admin.myei.app/shop/sk-store (staff login, /api/v1/auth/staff/login), reached via sk-store.myei.app/admin. Ticket documentation points testers to the wrong portal.</w:t>
+      </w:r>
+    </w:p>
+    <w:p>
+      <w:r>
+        <w:drawing>
+          <wp:inline distT="0" distB="0" distL="0" distR="0">
+            <wp:extent cx="5334000" cy="3333750"/>
+            <wp:effectExtent t="0" r="0" b="0" l="0"/>
+            <wp:docPr id="1" name="" descr="" title=""/>
+            <wp:cNvGraphicFramePr>
+              <a:graphicFrameLocks xmlns:a="http://schemas.openxmlformats.org/drawingml/2006/main" noChangeAspect="1"/>
+            </wp:cNvGraphicFramePr>
+            <a:graphic xmlns:a="http://schemas.openxmlformats.org/drawingml/2006/main">
+              <a:graphicData uri="http://schemas.openxmlformats.org/drawingml/2006/picture">
+                <pic:pic xmlns:pic="http://schemas.openxmlformats.org/drawingml/2006/picture">
+                  <pic:nvPicPr>
+                    <pic:cNvPr id="0" name="" descr=""/>
+                    <pic:cNvPicPr>
+                      <a:picLocks noChangeAspect="1" noChangeArrowheads="1"/>
+                    </pic:cNvPicPr>
+                  </pic:nvPicPr>
+                  <pic:blipFill>
+                    <a:blip r:embed="rId11" cstate="none"/>
                     <a:srcRect/>
                     <a:stretch>
                       <a:fillRect/>

</xml_diff>